<commit_message>
Show the as-designed sensitivity figure, not the cable-free one
Table 6.Z became the run with the cable and the optimised factors while
Figure 6.33 still showed the cable-free model, so the section's table and its
figure described different structures. It now shows blockA_2part_cable, which
analyse_block_A already generated.

The cable-free shape and diagnosis figures stay as 6.34 and 6.35, where they are
labelled as the control that shows why the crease needs a tie.

Co-Authored-By: Claude Opus 5 (1M context) <noreply@anthropic.com>
</commit_message>
<xml_diff>
--- a/imperfection_study/data/Section_6_5_3_Robustness.docx
+++ b/imperfection_study/data/Section_6_5_3_Robustness.docx
@@ -2087,7 +2087,7 @@
               <a:graphicData uri="http://schemas.openxmlformats.org/drawingml/2006/picture">
                 <pic:pic>
                   <pic:nvPicPr>
-                    <pic:cNvPr id="0" name="blockA_2part_sensitivity.png"/>
+                    <pic:cNvPr id="0" name="blockA_2part_cable_sensitivity.png"/>
                     <pic:cNvPicPr/>
                   </pic:nvPicPr>
                   <pic:blipFill>
@@ -2116,7 +2116,7 @@
           <w:i/>
           <w:sz w:val="18"/>
         </w:rPr>
-        <w:t>Figure 6.33: Block A on the creased shell, the same four panels. The ordering of the factors is the dome's with one swap, but E1 and E2/E1 exceed the linearity threshold here, so those two rows do not rescale to a different tolerance.</w:t>
+        <w:t>Figure 6.33: Block A on the creased shell as designed, the same four panels. The responses are smaller than the dome's throughout, the cable carrying what the fabric would otherwise have to. E1 and E2/E1 exceed the 15% asymmetry threshold in panel (c), but both are under 3 mm, so the non-linearity is on a quantity too small to matter.</w:t>
       </w:r>
     </w:p>
     <w:p>

</xml_diff>

<commit_message>
Show where the cable and the anchorage are, beside what they do
Figure 6.31 gained two plan panels. The curves in (d) and (e) are about a ring
and a cable; (c) and (f) say where on the structure those are, in the same
colours - the anchored boundary that R scales, and the crease cable running the
full span along x = 0.

It makes a point the numbers alone leave implicit: the cable and the crease are
the same line. An error in its rest length moves the one feature the design
exists to hold, which is why it is worth specifying rather than assuming, even
though per millimetre it is gentler than the boundary.

Co-Authored-By: Claude Opus 5 (1M context) <noreply@anthropic.com>
</commit_message>
<xml_diff>
--- a/imperfection_study/data/Section_6_5_3_Robustness.docx
+++ b/imperfection_study/data/Section_6_5_3_Robustness.docx
@@ -617,6 +617,14 @@
       </w:pPr>
       <w:r>
         <w:t>One percent is not a small error here. On the dome a one percent error in s_course moves the surface 3.9 mm and on the case study 2.8 mm, against a designed equilibrium that stands 10.3 mm from its target. Two percent roughly doubles both, the responses being linear across the range. The weak parameters are weak by an order of magnitude rather than marginally: one percent on the orthotropy ratio or on Poisson's ratio moves the case study by about 0.09 mm, below the precision any of this is measured to, and one percent on E1 by 0.26 mm.</w:t>
+      </w:r>
+    </w:p>
+    <w:p>
+      <w:pPr>
+        <w:jc w:val="both"/>
+      </w:pPr>
+      <w:r>
+        <w:t>Panels (c) and (f) say where on the structure those two parameters are. The dome is held on its ring alone. The creased shell is held on its ring and stiffened along the single line x = 0, where the crease cable runs the full span between two boundary anchorages: 19 vertices, 18 segments, 1.32 m of steel at EA = 157 kN. That the cable and the crease are the same line is the point of the design, and it is also why its rest length is a tolerance worth specifying — an error in it moves the feature the structure exists to hold.</w:t>
       </w:r>
     </w:p>
     <w:p>
@@ -1982,7 +1990,7 @@
       <w:r>
         <w:drawing>
           <wp:inline xmlns:a="http://schemas.openxmlformats.org/drawingml/2006/main" xmlns:pic="http://schemas.openxmlformats.org/drawingml/2006/picture">
-            <wp:extent cx="5669280" cy="4124862"/>
+            <wp:extent cx="5669280" cy="3114567"/>
             <wp:docPr id="1" name="Picture 1"/>
             <wp:cNvGraphicFramePr>
               <a:graphicFrameLocks noChangeAspect="1"/>
@@ -2003,7 +2011,7 @@
                   <pic:spPr>
                     <a:xfrm>
                       <a:off x="0" y="0"/>
-                      <a:ext cx="5669280" cy="4124862"/>
+                      <a:ext cx="5669280" cy="3114567"/>
                     </a:xfrm>
                     <a:prstGeom prst="rect"/>
                   </pic:spPr>
@@ -2020,7 +2028,7 @@
           <w:i/>
           <w:sz w:val="18"/>
         </w:rPr>
-        <w:t>Figure 6.31: Deviation from the designed equilibrium against how wrong each parameter is, 0 to 2% of nominal for the material and pre-strain parameters in (a) and (b), and 0 to 20 mm for the two that are set as lengths in (c) and (d) — a boundary ring is anchored to a distance and a cable is cut and taken up by one, so a percentage of nominal is a detour through a number nobody sets. The dotted line in (c) and (d) is the ±2 mm of 5.5.2. Curves are the worse of the two signs at each magnitude, and are linear throughout, so a response may be read at whatever tolerance the measurements eventually give. 180 solves across the two geometries.</w:t>
+        <w:t>Figure 6.31: Deviation from the designed equilibrium against how wrong each parameter is. (a) and (b) give the material and pre-strain parameters at 0 to 2% of nominal; (d) and (e) give the two that are set as lengths, at 0 to 20 mm, because a ring is anchored to a distance and a cable is cut and taken up by one, and a percentage of nominal is a detour through a number nobody sets. The dotted line in (d) and (e) is the ±2 mm of 5.5.2. (c) and (f) locate those two parameters on the structures in the same colours: the anchored boundary that R scales, and the crease cable along x = 0 whose rest length is the other length tolerance. Curves are the worse of the two signs at each magnitude and are linear throughout, so a response may be read at whatever tolerance the measurements eventually give. 180 solves across the two geometries.</w:t>
       </w:r>
     </w:p>
     <w:p>

</xml_diff>

<commit_message>
Put all eight parameters on one pair of axes per structure
The figure had split into four response panels and two plan views, which asks a
reader to compare curves across panels that share nothing but a y-axis. It is now
two plots, one per structure, carrying every parameter.

The two set as lengths keep their millimetre scale by reading on a second x-axis
along the top, drawn dashed to say which axis they belong to. Nothing is
rescaled and no unit is faked: the ring and the cable stay in millimetres, the
material and pre-strain parameters stay in percent, and both are visible at once.

The plan views of the anchorage and the cable are dropped.

Co-Authored-By: Claude Opus 5 (1M context) <noreply@anthropic.com>
</commit_message>
<xml_diff>
--- a/imperfection_study/data/Section_6_5_3_Robustness.docx
+++ b/imperfection_study/data/Section_6_5_3_Robustness.docx
@@ -624,15 +624,7 @@
         <w:jc w:val="both"/>
       </w:pPr>
       <w:r>
-        <w:t>Panels (c) and (f) say where on the structure those two parameters are. The dome is held on its ring alone. The creased shell is held on its ring and stiffened along the single line x = 0, where the crease cable runs the full span between two boundary anchorages: 19 vertices, 18 segments, 1.32 m of steel at EA = 157 kN. That the cable and the crease are the same line is the point of the design, and it is also why its rest length is a tolerance worth specifying — an error in it moves the feature the structure exists to hold.</w:t>
-      </w:r>
-    </w:p>
-    <w:p>
-      <w:pPr>
-        <w:jc w:val="both"/>
-      </w:pPr>
-      <w:r>
-        <w:t>The boundary radius and the cable rest length are set as lengths, not as fractions, so panels (c) and (d) give them in millimetres. At the ±2 mm of 5.5.2 the boundary contributes about 1.9 mm of surface deviation on both geometries. Ten millimetres of radius error would give 7.5 mm and ten of cable error 2.9 mm — the cable is the gentler of the two per millimetre, and only overtakes the stretch factors when expressed as a percentage because it is 1.32 m long. Both are quantities a workshop can measure directly, which makes them the two tolerances in this study that could be replaced by a measurement tomorrow.</w:t>
+        <w:t>The boundary radius and the cable rest length are set as lengths, not as fractions, so they are plotted against the top axis in millimetres. At the ±2 mm of 5.5.2 the boundary contributes about 1.9 mm of surface deviation on both geometries. Ten millimetres of radius error would give 7.5 mm and ten of cable error 2.9 mm — the cable is the gentler of the two per millimetre, and only overtakes the stretch factors when expressed as a percentage because it is 1.32 m long. Both are quantities a workshop can measure directly, which makes them the two tolerances in this study that could be replaced by a measurement tomorrow.</w:t>
       </w:r>
     </w:p>
     <w:p>
@@ -1990,7 +1982,7 @@
       <w:r>
         <w:drawing>
           <wp:inline xmlns:a="http://schemas.openxmlformats.org/drawingml/2006/main" xmlns:pic="http://schemas.openxmlformats.org/drawingml/2006/picture">
-            <wp:extent cx="5669280" cy="3114567"/>
+            <wp:extent cx="5669280" cy="2284026"/>
             <wp:docPr id="1" name="Picture 1"/>
             <wp:cNvGraphicFramePr>
               <a:graphicFrameLocks noChangeAspect="1"/>
@@ -2011,7 +2003,7 @@
                   <pic:spPr>
                     <a:xfrm>
                       <a:off x="0" y="0"/>
-                      <a:ext cx="5669280" cy="3114567"/>
+                      <a:ext cx="5669280" cy="2284026"/>
                     </a:xfrm>
                     <a:prstGeom prst="rect"/>
                   </pic:spPr>
@@ -2028,7 +2020,7 @@
           <w:i/>
           <w:sz w:val="18"/>
         </w:rPr>
-        <w:t>Figure 6.31: Deviation from the designed equilibrium against how wrong each parameter is. (a) and (b) give the material and pre-strain parameters at 0 to 2% of nominal; (d) and (e) give the two that are set as lengths, at 0 to 20 mm, because a ring is anchored to a distance and a cable is cut and taken up by one, and a percentage of nominal is a detour through a number nobody sets. The dotted line in (d) and (e) is the ±2 mm of 5.5.2. (c) and (f) locate those two parameters on the structures in the same colours: the anchored boundary that R scales, and the crease cable along x = 0 whose rest length is the other length tolerance. Curves are the worse of the two signs at each magnitude and are linear throughout, so a response may be read at whatever tolerance the measurements eventually give. 180 solves across the two geometries.</w:t>
+        <w:t>Figure 6.31: Deviation from the designed equilibrium against how wrong each parameter is, all eight on one pair of axes per structure. The solid curves are the material and pre-strain parameters and read on the bottom axis, in percent of nominal. The dashed curves are the two that are set as lengths — the boundary radius, and on the creased shell the crease cable's rest length — and read on the top axis, in millimetres, because a ring is anchored to a distance and a cable is cut and taken up by one, and a percentage of nominal is a detour through a number nobody sets. The dotted vertical is the ±2 mm of 5.5.2. Curves are the worse of the two signs at each magnitude and are linear throughout, so a response may be read at whatever tolerance the measurements eventually give. 180 solves across the two geometries.</w:t>
       </w:r>
     </w:p>
     <w:p>

</xml_diff>

<commit_message>
Put the length axis in centimetres, 0 to 2, matching the percent axis
The top axis ran 0 to 20 mm against a bottom axis of 0 to 2%, so the two scales
shared a frame without sharing a reading. In centimetres both run 0 to 2: the
gridlines line up, and a curve's position on the page means the same thing
whichever axis it belongs to.

Same data, same range - 2 cm is the 20 mm it already covered. The 5.5.2 marker
sits at 0.2 cm.

Co-Authored-By: Claude Opus 5 (1M context) <noreply@anthropic.com>
</commit_message>
<xml_diff>
--- a/imperfection_study/data/Section_6_5_3_Robustness.docx
+++ b/imperfection_study/data/Section_6_5_3_Robustness.docx
@@ -624,7 +624,7 @@
         <w:jc w:val="both"/>
       </w:pPr>
       <w:r>
-        <w:t>The boundary radius and the cable rest length are set as lengths, not as fractions, so they are plotted against the top axis in millimetres. At the ±2 mm of 5.5.2 the boundary contributes about 1.9 mm of surface deviation on both geometries. Ten millimetres of radius error would give 7.5 mm and ten of cable error 2.9 mm — the cable is the gentler of the two per millimetre, and only overtakes the stretch factors when expressed as a percentage because it is 1.32 m long. Both are quantities a workshop can measure directly, which makes them the two tolerances in this study that could be replaced by a measurement tomorrow.</w:t>
+        <w:t>The boundary radius and the cable rest length are set as lengths, not as fractions, so they are plotted against the top axis, in centimetres. The two scales run over the same numbers, 0 to 2% below and 0 to 2 cm above, so a curve's position on the page means the same thing whichever axis it belongs to. At the ±2 mm of 5.5.2 the boundary contributes about 1.9 mm of surface deviation on both geometries. Ten millimetres of radius error would give 7.5 mm and ten of cable error 2.9 mm — the cable is the gentler of the two per millimetre, and only overtakes the stretch factors when expressed as a percentage because it is 1.32 m long. Both are quantities a workshop can measure directly, which makes them the two tolerances in this study that could be replaced by a measurement tomorrow.</w:t>
       </w:r>
     </w:p>
     <w:p>
@@ -2020,7 +2020,7 @@
           <w:i/>
           <w:sz w:val="18"/>
         </w:rPr>
-        <w:t>Figure 6.31: Deviation from the designed equilibrium against how wrong each parameter is, all eight on one pair of axes per structure. The solid curves are the material and pre-strain parameters and read on the bottom axis, in percent of nominal. The dashed curves are the two that are set as lengths — the boundary radius, and on the creased shell the crease cable's rest length — and read on the top axis, in millimetres, because a ring is anchored to a distance and a cable is cut and taken up by one, and a percentage of nominal is a detour through a number nobody sets. The dotted vertical is the ±2 mm of 5.5.2. Curves are the worse of the two signs at each magnitude and are linear throughout, so a response may be read at whatever tolerance the measurements eventually give. 180 solves across the two geometries.</w:t>
+        <w:t>Figure 6.31: Deviation from the designed equilibrium against how wrong each parameter is, all eight on one pair of axes per structure. The solid curves are the material and pre-strain parameters and read on the bottom axis, in percent of nominal. The dashed curves are the two that are set as lengths — the boundary radius, and on the creased shell the crease cable's rest length — and read on the top axis, over 0 to 2 cm, because a ring is anchored to a distance and a cable is cut and taken up by one, and a percentage of nominal is a detour through a number nobody sets. The dotted vertical is the ±2 mm of 5.5.2. Curves are the worse of the two signs at each magnitude and are linear throughout, so a response may be read at whatever tolerance the measurements eventually give. 180 solves across the two geometries.</w:t>
       </w:r>
     </w:p>
     <w:p>

</xml_diff>